<commit_message>
Improve report templates and log diagnostics
</commit_message>
<xml_diff>
--- a/report_templates/china_general_business_report_template.docx
+++ b/report_templates/china_general_business_report_template.docx
@@ -31,7 +31,7 @@
     <w:p>
       <w:pPr/>
       <w:r>
-        <w:t>该模板适合中国企业常见的经营分析汇报结构，强调管理摘要、经营看板、问题诊断、策略建议和行动计划。</w:t>
+        <w:t>该模板适合中国企业常见的经营分析汇报场景，语言尽量直接、完整、方便业务和管理层阅读。</w:t>
       </w:r>
     </w:p>
     <w:p>
@@ -39,135 +39,307 @@
         <w:pStyle w:val="Heading1"/>
       </w:pPr>
       <w:r>
-        <w:t>推荐占位符</w:t>
+        <w:t>建议填写字段</w:t>
       </w:r>
     </w:p>
     <w:p>
-      <w:pPr>
-        <w:pStyle w:val="ListBullet"/>
-      </w:pPr>
+      <w:pPr/>
       <w:r>
-        <w:t>{{report_title}}</w:t>
+        <w:t>{</w:t>
       </w:r>
     </w:p>
     <w:p>
-      <w:pPr>
-        <w:pStyle w:val="ListBullet"/>
-      </w:pPr>
+      <w:pPr/>
       <w:r>
-        <w:t>{{executive_summary}}</w:t>
+        <w:t xml:space="preserve">  "报告标题": "请填写经营分析报告标题",</w:t>
       </w:r>
     </w:p>
     <w:p>
-      <w:pPr>
-        <w:pStyle w:val="ListBullet"/>
-      </w:pPr>
+      <w:pPr/>
       <w:r>
-        <w:t>{{management_summary}}</w:t>
+        <w:t xml:space="preserve">  "报告周期": "请填写，例如2026年3月",</w:t>
       </w:r>
     </w:p>
     <w:p>
-      <w:pPr>
-        <w:pStyle w:val="ListBullet"/>
-      </w:pPr>
+      <w:pPr/>
       <w:r>
-        <w:t>{{professional_analysis}}</w:t>
+        <w:t xml:space="preserve">  "汇报人": "请填写",</w:t>
       </w:r>
     </w:p>
     <w:p>
-      <w:pPr>
-        <w:pStyle w:val="ListBullet"/>
-      </w:pPr>
+      <w:pPr/>
       <w:r>
-        <w:t>{{strategy_recommendations}}</w:t>
+        <w:t xml:space="preserve">  "汇报对象": "请填写",</w:t>
       </w:r>
     </w:p>
     <w:p>
-      <w:pPr>
-        <w:pStyle w:val="ListBullet"/>
-      </w:pPr>
+      <w:pPr/>
       <w:r>
-        <w:t>{{management_actions}}</w:t>
+        <w:t xml:space="preserve">  "一、管理层摘要": {</w:t>
       </w:r>
     </w:p>
     <w:p>
-      <w:pPr>
-        <w:pStyle w:val="ListBullet"/>
-      </w:pPr>
+      <w:pPr/>
       <w:r>
-        <w:t>{{risk_watchouts}}</w:t>
+        <w:t xml:space="preserve">    "总体结论": "请填写",</w:t>
       </w:r>
     </w:p>
     <w:p>
-      <w:pPr>
-        <w:pStyle w:val="ListBullet"/>
-      </w:pPr>
+      <w:pPr/>
       <w:r>
-        <w:t>{{dashboard_snapshot}}</w:t>
+        <w:t xml:space="preserve">    "亮点概括": [</w:t>
       </w:r>
     </w:p>
     <w:p>
-      <w:pPr>
-        <w:pStyle w:val="ListBullet"/>
-      </w:pPr>
+      <w:pPr/>
       <w:r>
-        <w:t>{{detail_table}}</w:t>
+        <w:t xml:space="preserve">      "请填写亮点1",</w:t>
       </w:r>
     </w:p>
     <w:p>
-      <w:pPr>
-        <w:pStyle w:val="ListBullet"/>
-      </w:pPr>
+      <w:pPr/>
       <w:r>
-        <w:t>{{market_environment}}</w:t>
+        <w:t xml:space="preserve">      "请填写亮点2"</w:t>
       </w:r>
     </w:p>
     <w:p>
-      <w:pPr>
-        <w:pStyle w:val="ListBullet"/>
-      </w:pPr>
+      <w:pPr/>
       <w:r>
-        <w:t>{{business_overview}}</w:t>
+        <w:t xml:space="preserve">    ],</w:t>
       </w:r>
     </w:p>
     <w:p>
-      <w:pPr>
-        <w:pStyle w:val="ListBullet"/>
-      </w:pPr>
+      <w:pPr/>
       <w:r>
-        <w:t>{{channel_analysis}}</w:t>
+        <w:t xml:space="preserve">    "主要问题": [</w:t>
       </w:r>
     </w:p>
     <w:p>
-      <w:pPr>
-        <w:pStyle w:val="ListBullet"/>
-      </w:pPr>
+      <w:pPr/>
       <w:r>
-        <w:t>{{regional_analysis}}</w:t>
+        <w:t xml:space="preserve">      "请填写问题1"</w:t>
       </w:r>
     </w:p>
     <w:p>
-      <w:pPr>
-        <w:pStyle w:val="ListBullet"/>
-      </w:pPr>
+      <w:pPr/>
       <w:r>
-        <w:t>{{product_analysis}}</w:t>
+        <w:t xml:space="preserve">    ]</w:t>
       </w:r>
     </w:p>
     <w:p>
-      <w:pPr>
-        <w:pStyle w:val="ListBullet"/>
-      </w:pPr>
+      <w:pPr/>
       <w:r>
-        <w:t>{{problem_diagnosis}}</w:t>
+        <w:t xml:space="preserve">  },</w:t>
       </w:r>
     </w:p>
     <w:p>
-      <w:pPr>
-        <w:pStyle w:val="ListBullet"/>
-      </w:pPr>
+      <w:pPr/>
       <w:r>
-        <w:t>{{resource_requests}}</w:t>
+        <w:t xml:space="preserve">  "二、经营总览": {</w:t>
+      </w:r>
+    </w:p>
+    <w:p>
+      <w:pPr/>
+      <w:r>
+        <w:t xml:space="preserve">    "销售金额": "请填写",</w:t>
+      </w:r>
+    </w:p>
+    <w:p>
+      <w:pPr/>
+      <w:r>
+        <w:t xml:space="preserve">    "订单数": "请填写",</w:t>
+      </w:r>
+    </w:p>
+    <w:p>
+      <w:pPr/>
+      <w:r>
+        <w:t xml:space="preserve">    "客单价": "请填写",</w:t>
+      </w:r>
+    </w:p>
+    <w:p>
+      <w:pPr/>
+      <w:r>
+        <w:t xml:space="preserve">    "退款金额": "请填写"</w:t>
+      </w:r>
+    </w:p>
+    <w:p>
+      <w:pPr/>
+      <w:r>
+        <w:t xml:space="preserve">  },</w:t>
+      </w:r>
+    </w:p>
+    <w:p>
+      <w:pPr/>
+      <w:r>
+        <w:t xml:space="preserve">  "三、专项分析": [</w:t>
+      </w:r>
+    </w:p>
+    <w:p>
+      <w:pPr/>
+      <w:r>
+        <w:t xml:space="preserve">    {</w:t>
+      </w:r>
+    </w:p>
+    <w:p>
+      <w:pPr/>
+      <w:r>
+        <w:t xml:space="preserve">      "分析维度": "请填写，例如品牌/区域/会员等级",</w:t>
+      </w:r>
+    </w:p>
+    <w:p>
+      <w:pPr/>
+      <w:r>
+        <w:t xml:space="preserve">      "表现结论": "请填写",</w:t>
+      </w:r>
+    </w:p>
+    <w:p>
+      <w:pPr/>
+      <w:r>
+        <w:t xml:space="preserve">      "原因拆解": "请填写",</w:t>
+      </w:r>
+    </w:p>
+    <w:p>
+      <w:pPr/>
+      <w:r>
+        <w:t xml:space="preserve">      "建议动作": "请填写"</w:t>
+      </w:r>
+    </w:p>
+    <w:p>
+      <w:pPr/>
+      <w:r>
+        <w:t xml:space="preserve">    }</w:t>
+      </w:r>
+    </w:p>
+    <w:p>
+      <w:pPr/>
+      <w:r>
+        <w:t xml:space="preserve">  ],</w:t>
+      </w:r>
+    </w:p>
+    <w:p>
+      <w:pPr/>
+      <w:r>
+        <w:t xml:space="preserve">  "四、经营策略建议": [</w:t>
+      </w:r>
+    </w:p>
+    <w:p>
+      <w:pPr/>
+      <w:r>
+        <w:t xml:space="preserve">    "请填写策略建议1",</w:t>
+      </w:r>
+    </w:p>
+    <w:p>
+      <w:pPr/>
+      <w:r>
+        <w:t xml:space="preserve">    "请填写策略建议2"</w:t>
+      </w:r>
+    </w:p>
+    <w:p>
+      <w:pPr/>
+      <w:r>
+        <w:t xml:space="preserve">  ],</w:t>
+      </w:r>
+    </w:p>
+    <w:p>
+      <w:pPr/>
+      <w:r>
+        <w:t xml:space="preserve">  "五、重点行动计划": [</w:t>
+      </w:r>
+    </w:p>
+    <w:p>
+      <w:pPr/>
+      <w:r>
+        <w:t xml:space="preserve">    {</w:t>
+      </w:r>
+    </w:p>
+    <w:p>
+      <w:pPr/>
+      <w:r>
+        <w:t xml:space="preserve">      "责任人": "请填写",</w:t>
+      </w:r>
+    </w:p>
+    <w:p>
+      <w:pPr/>
+      <w:r>
+        <w:t xml:space="preserve">      "动作": "请填写",</w:t>
+      </w:r>
+    </w:p>
+    <w:p>
+      <w:pPr/>
+      <w:r>
+        <w:t xml:space="preserve">      "目标": "请填写",</w:t>
+      </w:r>
+    </w:p>
+    <w:p>
+      <w:pPr/>
+      <w:r>
+        <w:t xml:space="preserve">      "时间节点": "请填写"</w:t>
+      </w:r>
+    </w:p>
+    <w:p>
+      <w:pPr/>
+      <w:r>
+        <w:t xml:space="preserve">    }</w:t>
+      </w:r>
+    </w:p>
+    <w:p>
+      <w:pPr/>
+      <w:r>
+        <w:t xml:space="preserve">  ],</w:t>
+      </w:r>
+    </w:p>
+    <w:p>
+      <w:pPr/>
+      <w:r>
+        <w:t xml:space="preserve">  "六、风险与资源需求": {</w:t>
+      </w:r>
+    </w:p>
+    <w:p>
+      <w:pPr/>
+      <w:r>
+        <w:t xml:space="preserve">    "风险提示": [</w:t>
+      </w:r>
+    </w:p>
+    <w:p>
+      <w:pPr/>
+      <w:r>
+        <w:t xml:space="preserve">      "请填写风险点"</w:t>
+      </w:r>
+    </w:p>
+    <w:p>
+      <w:pPr/>
+      <w:r>
+        <w:t xml:space="preserve">    ],</w:t>
+      </w:r>
+    </w:p>
+    <w:p>
+      <w:pPr/>
+      <w:r>
+        <w:t xml:space="preserve">    "资源需求": [</w:t>
+      </w:r>
+    </w:p>
+    <w:p>
+      <w:pPr/>
+      <w:r>
+        <w:t xml:space="preserve">      "请填写资源诉求"</w:t>
+      </w:r>
+    </w:p>
+    <w:p>
+      <w:pPr/>
+      <w:r>
+        <w:t xml:space="preserve">    ]</w:t>
+      </w:r>
+    </w:p>
+    <w:p>
+      <w:pPr/>
+      <w:r>
+        <w:t xml:space="preserve">  }</w:t>
+      </w:r>
+    </w:p>
+    <w:p>
+      <w:pPr/>
+      <w:r>
+        <w:t>}</w:t>
       </w:r>
     </w:p>
     <w:p>
@@ -203,13 +375,13 @@
         <w:pStyle w:val="Heading1"/>
       </w:pPr>
       <w:r>
-        <w:t>三、市场与行业环境</w:t>
+        <w:t>三、专项分析</w:t>
       </w:r>
     </w:p>
     <w:p>
       <w:pPr/>
       <w:r>
-        <w:t>补充宏观环境、行业趋势、竞争态势或渠道变化。</w:t>
+        <w:t>按区域、渠道、品牌、品类、用户等维度拆解表现和结构变化。</w:t>
       </w:r>
     </w:p>
     <w:p>
@@ -217,21 +389,7 @@
         <w:pStyle w:val="Heading1"/>
       </w:pPr>
       <w:r>
-        <w:t>四、区域/渠道/产品专题分析</w:t>
-      </w:r>
-    </w:p>
-    <w:p>
-      <w:pPr/>
-      <w:r>
-        <w:t>按区域、渠道、产品、用户等维度拆解业绩表现与结构变化。</w:t>
-      </w:r>
-    </w:p>
-    <w:p>
-      <w:pPr>
-        <w:pStyle w:val="Heading1"/>
-      </w:pPr>
-      <w:r>
-        <w:t>五、问题诊断</w:t>
+        <w:t>四、问题诊断</w:t>
       </w:r>
     </w:p>
     <w:p>
@@ -245,7 +403,7 @@
         <w:pStyle w:val="Heading1"/>
       </w:pPr>
       <w:r>
-        <w:t>六、策略建议</w:t>
+        <w:t>五、经营策略建议</w:t>
       </w:r>
     </w:p>
     <w:p>
@@ -259,7 +417,7 @@
         <w:pStyle w:val="Heading1"/>
       </w:pPr>
       <w:r>
-        <w:t>七、重点行动计划</w:t>
+        <w:t>六、重点行动计划</w:t>
       </w:r>
     </w:p>
     <w:p>
@@ -273,7 +431,7 @@
         <w:pStyle w:val="Heading1"/>
       </w:pPr>
       <w:r>
-        <w:t>八、风险与资源需求</w:t>
+        <w:t>七、风险与资源需求</w:t>
       </w:r>
     </w:p>
     <w:p>
@@ -287,7 +445,7 @@
         <w:pStyle w:val="Heading1"/>
       </w:pPr>
       <w:r>
-        <w:t>九、附录</w:t>
+        <w:t>八、附录</w:t>
       </w:r>
     </w:p>
     <w:p>

</xml_diff>